<commit_message>
Update Acoustic Data Processing SOP.docx
</commit_message>
<xml_diff>
--- a/Acoustic Data Processing SOP.docx
+++ b/Acoustic Data Processing SOP.docx
@@ -4,6 +4,24 @@
   <w:body>
     <w:p>
       <w:r>
+        <w:t xml:space="preserve">Code can be found here: </w:t>
+      </w:r>
+      <w:hyperlink r:id="rId5" w:history="1">
+        <w:r>
+          <w:rPr>
+            <w:rStyle w:val="Hyperlink"/>
+          </w:rPr>
+          <w:t>https://github.com/dsmossman/AZFP_acoustics_processing</w:t>
+        </w:r>
+      </w:hyperlink>
+    </w:p>
+    <w:p>
+      <w:r>
+        <w:t>Can clone the repository to your machine or download the entire thing as a ZIP</w:t>
+      </w:r>
+    </w:p>
+    <w:p>
+      <w:r>
         <w:t>The order of operations goes like this:</w:t>
       </w:r>
     </w:p>
@@ -44,6 +62,9 @@
       <w:r>
         <w:t>Each folder has its own readme which goes into further detail about each file.</w:t>
       </w:r>
+      <w:r>
+        <w:t xml:space="preserve"> In addition, each code file has been commented to the best of my ability explaining in further detail what each line does; thus, this SOP will only provide a broad overview of which files should be run in which order, and what is necessary to avoid errors.</w:t>
+      </w:r>
     </w:p>
     <w:p>
       <w:r>
@@ -52,21 +73,23 @@
     </w:p>
     <w:p>
       <w:r>
+        <w:br w:type="page"/>
+      </w:r>
+    </w:p>
+    <w:p>
+      <w:pPr>
+        <w:pStyle w:val="Heading1"/>
+      </w:pPr>
+      <w:r>
+        <w:lastRenderedPageBreak/>
         <w:t>Raw_data_processing</w:t>
       </w:r>
     </w:p>
     <w:p>
       <w:pPr>
-        <w:rPr>
-          <w:b/>
-          <w:bCs/>
-        </w:rPr>
-      </w:pPr>
-      <w:r>
-        <w:rPr>
-          <w:b/>
-          <w:bCs/>
-        </w:rPr>
+        <w:pStyle w:val="Heading2"/>
+      </w:pPr>
+      <w:r>
         <w:t>Assumptions</w:t>
       </w:r>
     </w:p>
@@ -117,7 +140,16 @@
         </w:numPr>
       </w:pPr>
       <w:r>
-        <w:t>You have downloaded a .csv file of the deployment that contains at minimum time/date/lat/long/depth/pitch/roll information about the platform.</w:t>
+        <w:t xml:space="preserve">You have downloaded a .csv file of </w:t>
+      </w:r>
+      <w:r>
+        <w:t>data</w:t>
+      </w:r>
+      <w:r>
+        <w:t xml:space="preserve"> that contains at minimum time/date/lat/long/depth/pitch/roll information about the platform</w:t>
+      </w:r>
+      <w:r>
+        <w:t xml:space="preserve"> on which the AZFP is mounted.</w:t>
       </w:r>
     </w:p>
     <w:p>
@@ -156,16 +188,9 @@
     </w:p>
     <w:p>
       <w:pPr>
-        <w:rPr>
-          <w:b/>
-          <w:bCs/>
-        </w:rPr>
-      </w:pPr>
-      <w:r>
-        <w:rPr>
-          <w:b/>
-          <w:bCs/>
-        </w:rPr>
+        <w:pStyle w:val="Heading2"/>
+      </w:pPr>
+      <w:r>
         <w:t>Steps</w:t>
       </w:r>
     </w:p>
@@ -177,7 +202,13 @@
         </w:numPr>
       </w:pPr>
       <w:r>
-        <w:t>Run the AZFP_data_by_day.py file to organize the AZFP data into daily subfolders within the monthly folder.</w:t>
+        <w:t>Run the AZFP_data_by_day.py file to organize the AZFP data into daily subfolders within the monthly folder</w:t>
+      </w:r>
+      <w:r>
+        <w:t>; each day’s subfolder contains the AZFP data for the day and a copy of the .cfg file mentioned above</w:t>
+      </w:r>
+      <w:r>
+        <w:t>.</w:t>
       </w:r>
     </w:p>
     <w:p>
@@ -188,7 +219,13 @@
         </w:numPr>
       </w:pPr>
       <w:r>
-        <w:t>Run the Echoview_File_Formatting_From_ERRDAP.m file to create specifically formatted time/date, pitch, roll, and depth files that Echoview can read and use.</w:t>
+        <w:t>Run the Echoview_File_Formatting_From_ERRDAP.m file to create specifically formatted time/date, pitch, roll, and depth files</w:t>
+      </w:r>
+      <w:r>
+        <w:t xml:space="preserve"> from your deployment platform data</w:t>
+      </w:r>
+      <w:r>
+        <w:t xml:space="preserve"> that Echoview can read and use.</w:t>
       </w:r>
     </w:p>
     <w:p>
@@ -199,7 +236,16 @@
         </w:numPr>
       </w:pPr>
       <w:r>
-        <w:t>Plug in your Echoview dongle, then run the EV_File_Using_Template.py file to generate an Echoview file from each day of data (my templates can be found in the misc folder).</w:t>
+        <w:t xml:space="preserve">Plug in your Echoview dongle, then run the EV_File_Using_Template.py file to generate an Echoview file from each day of data (templates </w:t>
+      </w:r>
+      <w:r>
+        <w:t>referenced within the code ar</w:t>
+      </w:r>
+      <w:r>
+        <w:t>e</w:t>
+      </w:r>
+      <w:r>
+        <w:t xml:space="preserve"> found in the misc folder).</w:t>
       </w:r>
     </w:p>
     <w:p>
@@ -210,8 +256,19 @@
         </w:numPr>
       </w:pPr>
       <w:r>
-        <w:lastRenderedPageBreak/>
-        <w:t>Manually open each new EV file and set the seafloor using whatever algorithm best suits your data (unfortunately this step can't be automated in the code, at least as far as I can figure out).</w:t>
+        <w:t xml:space="preserve">Manually open each new EV file and </w:t>
+      </w:r>
+      <w:r>
+        <w:t>calculate</w:t>
+      </w:r>
+      <w:r>
+        <w:t xml:space="preserve"> the seafloor</w:t>
+      </w:r>
+      <w:r>
+        <w:t xml:space="preserve"> line</w:t>
+      </w:r>
+      <w:r>
+        <w:t xml:space="preserve"> using whatever algorithm best suits your data (unfortunately this step can't be automated in the code, at least as far as I can figure out).</w:t>
       </w:r>
     </w:p>
     <w:p>
@@ -222,7 +279,10 @@
         </w:numPr>
       </w:pPr>
       <w:r>
-        <w:t>Run the EV_File_Export.py file to export your processed data to .csv files - make sure that the frequencies being exported line up with the AZFP configuration!</w:t>
+        <w:t>Run the EV_File_Export.py file to export your processed data to .csv files</w:t>
+      </w:r>
+      <w:r>
+        <w:t>.</w:t>
       </w:r>
     </w:p>
     <w:p>
@@ -238,21 +298,23 @@
     </w:p>
     <w:p>
       <w:r>
+        <w:br w:type="page"/>
+      </w:r>
+    </w:p>
+    <w:p>
+      <w:pPr>
+        <w:pStyle w:val="Heading1"/>
+      </w:pPr>
+      <w:r>
+        <w:lastRenderedPageBreak/>
         <w:t>Acoustic_abundance_estimates</w:t>
       </w:r>
     </w:p>
     <w:p>
       <w:pPr>
-        <w:rPr>
-          <w:b/>
-          <w:bCs/>
-        </w:rPr>
-      </w:pPr>
-      <w:r>
-        <w:rPr>
-          <w:b/>
-          <w:bCs/>
-        </w:rPr>
+        <w:pStyle w:val="Heading2"/>
+      </w:pPr>
+      <w:r>
         <w:t>Assumptions</w:t>
       </w:r>
     </w:p>
@@ -264,7 +326,10 @@
         </w:numPr>
       </w:pPr>
       <w:r>
-        <w:t>You've already run the raw_data_processing code.</w:t>
+        <w:t xml:space="preserve">You've already run the raw_data_processing </w:t>
+      </w:r>
+      <w:r>
+        <w:t>part of this pipeline.</w:t>
       </w:r>
     </w:p>
     <w:p>
@@ -275,7 +340,19 @@
         </w:numPr>
       </w:pPr>
       <w:r>
-        <w:t>The data are contained in a file structure that follows the format [name of deployment]/Echoview CSV Export Files/[monthly folder] (e.g. ru39-20230420T1636/Echoview CSV Export Files/202304).</w:t>
+        <w:t xml:space="preserve">The </w:t>
+      </w:r>
+      <w:r>
+        <w:t xml:space="preserve">exported .csv </w:t>
+      </w:r>
+      <w:r>
+        <w:t>data</w:t>
+      </w:r>
+      <w:r>
+        <w:t xml:space="preserve"> from Echoview</w:t>
+      </w:r>
+      <w:r>
+        <w:t xml:space="preserve"> are contained in a file structure that follows the format [name of deployment]/Echoview CSV Export Files/[monthly folder] (e.g. ru39-20230420T1636/Echoview CSV Export Files/202304).</w:t>
       </w:r>
     </w:p>
     <w:p>
@@ -297,16 +374,9 @@
     </w:p>
     <w:p>
       <w:pPr>
-        <w:rPr>
-          <w:b/>
-          <w:bCs/>
-        </w:rPr>
-      </w:pPr>
-      <w:r>
-        <w:rPr>
-          <w:b/>
-          <w:bCs/>
-        </w:rPr>
+        <w:pStyle w:val="Heading2"/>
+      </w:pPr>
+      <w:r>
         <w:t>Steps</w:t>
       </w:r>
     </w:p>
@@ -356,21 +426,23 @@
     </w:p>
     <w:p>
       <w:r>
+        <w:br w:type="page"/>
+      </w:r>
+    </w:p>
+    <w:p>
+      <w:pPr>
+        <w:pStyle w:val="Heading1"/>
+      </w:pPr>
+      <w:r>
+        <w:lastRenderedPageBreak/>
         <w:t>Alignment_and_plotting</w:t>
       </w:r>
     </w:p>
     <w:p>
       <w:pPr>
-        <w:rPr>
-          <w:b/>
-          <w:bCs/>
-        </w:rPr>
-      </w:pPr>
-      <w:r>
-        <w:rPr>
-          <w:b/>
-          <w:bCs/>
-        </w:rPr>
+        <w:pStyle w:val="Heading2"/>
+      </w:pPr>
+      <w:r>
         <w:t>Assumptions</w:t>
       </w:r>
     </w:p>
@@ -382,7 +454,13 @@
         </w:numPr>
       </w:pPr>
       <w:r>
-        <w:t>You've already run the acoustic_abundance_estimates code.</w:t>
+        <w:t xml:space="preserve">You've already run the acoustic_abundance_estimates </w:t>
+      </w:r>
+      <w:r>
+        <w:t>part of this pipeline</w:t>
+      </w:r>
+      <w:r>
+        <w:t>.</w:t>
       </w:r>
     </w:p>
     <w:p>
@@ -398,27 +476,9 @@
     </w:p>
     <w:p>
       <w:pPr>
-        <w:numPr>
-          <w:ilvl w:val="0"/>
-          <w:numId w:val="6"/>
-        </w:numPr>
-      </w:pPr>
-      <w:r>
-        <w:t>You also have data from a separate simultaneous glider deployment about whale detections.</w:t>
-      </w:r>
-    </w:p>
-    <w:p>
-      <w:pPr>
-        <w:rPr>
-          <w:b/>
-          <w:bCs/>
-        </w:rPr>
-      </w:pPr>
-      <w:r>
-        <w:rPr>
-          <w:b/>
-          <w:bCs/>
-        </w:rPr>
+        <w:pStyle w:val="Heading2"/>
+      </w:pPr>
+      <w:r>
         <w:t>Steps</w:t>
       </w:r>
     </w:p>
@@ -430,8 +490,10 @@
         </w:numPr>
       </w:pPr>
       <w:r>
-        <w:lastRenderedPageBreak/>
         <w:t>Run the Rutgers_Echosounder_Biomass_Processing.R file to create three different .rdata files: one for glider data, one for "peripheral" (bathymetry, wind farm lease areas, and marine mammal detections) data, and one for acoustic abundance estimate data.</w:t>
+      </w:r>
+      <w:r>
+        <w:t xml:space="preserve"> This takes a little while!</w:t>
       </w:r>
     </w:p>
     <w:p>
@@ -443,6 +505,28 @@
       </w:pPr>
       <w:r>
         <w:t>Run the Rutgers_Echosounder_Biomass_Plotting.R file to create several different kinds of plots, including concentration/biomass by day, by depth and time, and by lat/long and time.</w:t>
+      </w:r>
+      <w:r>
+        <w:t xml:space="preserve"> Includes the option to plot concurrent whale detection data if you have it.</w:t>
+      </w:r>
+    </w:p>
+    <w:p>
+      <w:r>
+        <w:br w:type="page"/>
+      </w:r>
+    </w:p>
+    <w:p>
+      <w:pPr>
+        <w:pStyle w:val="Heading1"/>
+      </w:pPr>
+      <w:r>
+        <w:lastRenderedPageBreak/>
+        <w:t>Misc Folder</w:t>
+      </w:r>
+    </w:p>
+    <w:p>
+      <w:r>
+        <w:t>This folder contains some one-off code files that are not directly related to the main acoustic processing pipeline, including code investigations for specific deployments, supporting Matlab functions, and FTLE/chlorophyll data analysis files.</w:t>
       </w:r>
     </w:p>
     <w:sectPr>
@@ -1700,7 +1784,6 @@
     <w:next w:val="Normal"/>
     <w:link w:val="Heading2Char"/>
     <w:uiPriority w:val="9"/>
-    <w:semiHidden/>
     <w:unhideWhenUsed/>
     <w:qFormat/>
     <w:rsid w:val="00730735"/>
@@ -1875,6 +1958,7 @@
   <w:style w:type="character" w:default="1" w:styleId="DefaultParagraphFont">
     <w:name w:val="Default Paragraph Font"/>
     <w:uiPriority w:val="1"/>
+    <w:semiHidden/>
     <w:unhideWhenUsed/>
   </w:style>
   <w:style w:type="table" w:default="1" w:styleId="TableNormal">
@@ -1916,7 +2000,6 @@
     <w:basedOn w:val="DefaultParagraphFont"/>
     <w:link w:val="Heading2"/>
     <w:uiPriority w:val="9"/>
-    <w:semiHidden/>
     <w:rsid w:val="00730735"/>
     <w:rPr>
       <w:rFonts w:asciiTheme="majorHAnsi" w:eastAsiaTheme="majorEastAsia" w:hAnsiTheme="majorHAnsi" w:cstheme="majorBidi"/>
@@ -2186,6 +2269,29 @@
       <w:smallCaps/>
       <w:color w:val="0F4761" w:themeColor="accent1" w:themeShade="BF"/>
       <w:spacing w:val="5"/>
+    </w:rPr>
+  </w:style>
+  <w:style w:type="character" w:styleId="Hyperlink">
+    <w:name w:val="Hyperlink"/>
+    <w:basedOn w:val="DefaultParagraphFont"/>
+    <w:uiPriority w:val="99"/>
+    <w:unhideWhenUsed/>
+    <w:rsid w:val="00D168A7"/>
+    <w:rPr>
+      <w:color w:val="467886" w:themeColor="hyperlink"/>
+      <w:u w:val="single"/>
+    </w:rPr>
+  </w:style>
+  <w:style w:type="character" w:styleId="UnresolvedMention">
+    <w:name w:val="Unresolved Mention"/>
+    <w:basedOn w:val="DefaultParagraphFont"/>
+    <w:uiPriority w:val="99"/>
+    <w:semiHidden/>
+    <w:unhideWhenUsed/>
+    <w:rsid w:val="00D168A7"/>
+    <w:rPr>
+      <w:color w:val="605E5C"/>
+      <w:shd w:val="clear" w:color="auto" w:fill="E1DFDD"/>
     </w:rPr>
   </w:style>
 </w:styles>

</xml_diff>